<commit_message>
feat: gráfico evolución por semana con Chart.js
</commit_message>
<xml_diff>
--- a/public/templates/template_avisos.docx
+++ b/public/templates/template_avisos.docx
@@ -127,7 +127,15 @@
                       <w:b/>
                       <w:sz w:val="22"/>
                     </w:rPr>
-                    <w:t>O.T. N°05</w:t>
+                    <w:t>O.T. N°</w:t>
+                  </w:r>
+                  <w:r>
+                    <w:rPr>
+                      <w:rFonts w:ascii="Arial" w:eastAsia="Arial" w:hAnsi="Arial" w:cs="Arial"/>
+                      <w:b/>
+                      <w:sz w:val="22"/>
+                    </w:rPr>
+                    <w:t>{ot}</w:t>
                   </w:r>
                 </w:p>
               </w:tc>

</xml_diff>

<commit_message>
fix: color fecha reporte, columnas fijas, nomenclatura archivos Word, codigo OT en wizard
</commit_message>
<xml_diff>
--- a/public/templates/template_avisos.docx
+++ b/public/templates/template_avisos.docx
@@ -127,15 +127,43 @@
                       <w:b/>
                       <w:sz w:val="22"/>
                     </w:rPr>
-                    <w:t>O.T. N°</w:t>
+                    <w:t xml:space="preserve">O.T. </w:t>
                   </w:r>
+                  <w:proofErr w:type="spellStart"/>
                   <w:r>
                     <w:rPr>
                       <w:rFonts w:ascii="Arial" w:eastAsia="Arial" w:hAnsi="Arial" w:cs="Arial"/>
                       <w:b/>
                       <w:sz w:val="22"/>
                     </w:rPr>
-                    <w:t>{ot}</w:t>
+                    <w:t>N°</w:t>
+                  </w:r>
+                  <w:proofErr w:type="spellEnd"/>
+                  <w:r>
+                    <w:rPr>
+                      <w:rFonts w:ascii="Arial" w:eastAsia="Arial" w:hAnsi="Arial" w:cs="Arial"/>
+                      <w:b/>
+                      <w:sz w:val="22"/>
+                    </w:rPr>
+                    <w:t>{</w:t>
+                  </w:r>
+                  <w:proofErr w:type="spellStart"/>
+                  <w:r>
+                    <w:rPr>
+                      <w:rFonts w:ascii="Arial" w:eastAsia="Arial" w:hAnsi="Arial" w:cs="Arial"/>
+                      <w:b/>
+                      <w:sz w:val="22"/>
+                    </w:rPr>
+                    <w:t>ot</w:t>
+                  </w:r>
+                  <w:proofErr w:type="spellEnd"/>
+                  <w:r>
+                    <w:rPr>
+                      <w:rFonts w:ascii="Arial" w:eastAsia="Arial" w:hAnsi="Arial" w:cs="Arial"/>
+                      <w:b/>
+                      <w:sz w:val="22"/>
+                    </w:rPr>
+                    <w:t>}</w:t>
                   </w:r>
                 </w:p>
               </w:tc>
@@ -161,7 +189,33 @@
                       <w:b/>
                       <w:sz w:val="22"/>
                     </w:rPr>
-                    <w:t xml:space="preserve">   EPU16IP26</w:t>
+                    <w:t>{</w:t>
+                  </w:r>
+                  <w:proofErr w:type="spellStart"/>
+                  <w:r>
+                    <w:rPr>
+                      <w:rFonts w:ascii="Arial" w:eastAsia="Arial" w:hAnsi="Arial" w:cs="Arial"/>
+                      <w:b/>
+                      <w:sz w:val="22"/>
+                    </w:rPr>
+                    <w:t>sk</w:t>
+                  </w:r>
+                  <w:proofErr w:type="spellEnd"/>
+                  <w:r>
+                    <w:rPr>
+                      <w:rFonts w:ascii="Arial" w:eastAsia="Arial" w:hAnsi="Arial" w:cs="Arial"/>
+                      <w:b/>
+                      <w:sz w:val="22"/>
+                    </w:rPr>
+                    <w:t>}</w:t>
+                  </w:r>
+                  <w:r>
+                    <w:rPr>
+                      <w:rFonts w:ascii="Arial" w:eastAsia="Arial" w:hAnsi="Arial" w:cs="Arial"/>
+                      <w:b/>
+                      <w:sz w:val="22"/>
+                    </w:rPr>
+                    <w:t xml:space="preserve"> </w:t>
                   </w:r>
                 </w:p>
               </w:tc>
@@ -210,7 +264,23 @@
           <w:rFonts w:ascii="Arial" w:eastAsia="Arial" w:hAnsi="Arial" w:cs="Arial"/>
           <w:sz w:val="18"/>
         </w:rPr>
-        <w:t>Contrato {ct}</w:t>
+        <w:t>Contrato {</w:t>
+      </w:r>
+      <w:proofErr w:type="spellStart"/>
+      <w:r>
+        <w:rPr>
+          <w:rFonts w:ascii="Arial" w:eastAsia="Arial" w:hAnsi="Arial" w:cs="Arial"/>
+          <w:sz w:val="18"/>
+        </w:rPr>
+        <w:t>ct</w:t>
+      </w:r>
+      <w:proofErr w:type="spellEnd"/>
+      <w:r>
+        <w:rPr>
+          <w:rFonts w:ascii="Arial" w:eastAsia="Arial" w:hAnsi="Arial" w:cs="Arial"/>
+          <w:sz w:val="18"/>
+        </w:rPr>
+        <w:t>}</w:t>
       </w:r>
     </w:p>
     <w:p>
@@ -363,7 +433,25 @@
           <w:color w:val="0000FF"/>
           <w:sz w:val="18"/>
         </w:rPr>
-        <w:t>{av}</w:t>
+        <w:t>{</w:t>
+      </w:r>
+      <w:proofErr w:type="spellStart"/>
+      <w:r>
+        <w:rPr>
+          <w:b/>
+          <w:color w:val="0000FF"/>
+          <w:sz w:val="18"/>
+        </w:rPr>
+        <w:t>av</w:t>
+      </w:r>
+      <w:proofErr w:type="spellEnd"/>
+      <w:r>
+        <w:rPr>
+          <w:b/>
+          <w:color w:val="0000FF"/>
+          <w:sz w:val="18"/>
+        </w:rPr>
+        <w:t>}</w:t>
       </w:r>
     </w:p>
     <w:p>
@@ -394,7 +482,25 @@
           <w:color w:val="0000FF"/>
           <w:sz w:val="18"/>
         </w:rPr>
-        <w:t>{ed}</w:t>
+        <w:t>{</w:t>
+      </w:r>
+      <w:proofErr w:type="spellStart"/>
+      <w:r>
+        <w:rPr>
+          <w:b/>
+          <w:color w:val="0000FF"/>
+          <w:sz w:val="18"/>
+        </w:rPr>
+        <w:t>ed</w:t>
+      </w:r>
+      <w:proofErr w:type="spellEnd"/>
+      <w:r>
+        <w:rPr>
+          <w:b/>
+          <w:color w:val="0000FF"/>
+          <w:sz w:val="18"/>
+        </w:rPr>
+        <w:t>}</w:t>
       </w:r>
     </w:p>
     <w:tbl>
@@ -442,6 +548,7 @@
               <w:ind w:left="43" w:right="0" w:firstLine="0"/>
               <w:jc w:val="both"/>
             </w:pPr>
+            <w:proofErr w:type="spellStart"/>
             <w:r>
               <w:rPr>
                 <w:rFonts w:ascii="Arial" w:eastAsia="Arial" w:hAnsi="Arial" w:cs="Arial"/>
@@ -450,6 +557,7 @@
               </w:rPr>
               <w:t>N°</w:t>
             </w:r>
+            <w:proofErr w:type="spellEnd"/>
           </w:p>
         </w:tc>
         <w:tc>
@@ -747,7 +855,15 @@
               <w:jc w:val="center"/>
             </w:pPr>
             <w:r>
-              <w:t>{ot}</w:t>
+              <w:t>{</w:t>
+            </w:r>
+            <w:proofErr w:type="spellStart"/>
+            <w:r>
+              <w:t>ot</w:t>
+            </w:r>
+            <w:proofErr w:type="spellEnd"/>
+            <w:r>
+              <w:t>}</w:t>
             </w:r>
           </w:p>
         </w:tc>
@@ -771,7 +887,21 @@
               <w:rPr>
                 <w:b/>
               </w:rPr>
-              <w:t>{sk}</w:t>
+              <w:t>{</w:t>
+            </w:r>
+            <w:proofErr w:type="spellStart"/>
+            <w:r>
+              <w:rPr>
+                <w:b/>
+              </w:rPr>
+              <w:t>sk</w:t>
+            </w:r>
+            <w:proofErr w:type="spellEnd"/>
+            <w:r>
+              <w:rPr>
+                <w:b/>
+              </w:rPr>
+              <w:t>}</w:t>
             </w:r>
           </w:p>
         </w:tc>
@@ -868,7 +998,23 @@
                 <w:rFonts w:ascii="Arial" w:eastAsia="Arial" w:hAnsi="Arial" w:cs="Arial"/>
                 <w:sz w:val="15"/>
               </w:rPr>
-              <w:t>{pz}</w:t>
+              <w:t>{</w:t>
+            </w:r>
+            <w:proofErr w:type="spellStart"/>
+            <w:r>
+              <w:rPr>
+                <w:rFonts w:ascii="Arial" w:eastAsia="Arial" w:hAnsi="Arial" w:cs="Arial"/>
+                <w:sz w:val="15"/>
+              </w:rPr>
+              <w:t>pz</w:t>
+            </w:r>
+            <w:proofErr w:type="spellEnd"/>
+            <w:r>
+              <w:rPr>
+                <w:rFonts w:ascii="Arial" w:eastAsia="Arial" w:hAnsi="Arial" w:cs="Arial"/>
+                <w:sz w:val="15"/>
+              </w:rPr>
+              <w:t>}</w:t>
             </w:r>
           </w:p>
         </w:tc>
@@ -894,7 +1040,25 @@
                 <w:b/>
                 <w:sz w:val="14"/>
               </w:rPr>
-              <w:t>{cn}</w:t>
+              <w:t>{</w:t>
+            </w:r>
+            <w:proofErr w:type="spellStart"/>
+            <w:r>
+              <w:rPr>
+                <w:rFonts w:ascii="Arial" w:eastAsia="Arial" w:hAnsi="Arial" w:cs="Arial"/>
+                <w:b/>
+                <w:sz w:val="14"/>
+              </w:rPr>
+              <w:t>cn</w:t>
+            </w:r>
+            <w:proofErr w:type="spellEnd"/>
+            <w:r>
+              <w:rPr>
+                <w:rFonts w:ascii="Arial" w:eastAsia="Arial" w:hAnsi="Arial" w:cs="Arial"/>
+                <w:b/>
+                <w:sz w:val="14"/>
+              </w:rPr>
+              <w:t>}</w:t>
             </w:r>
           </w:p>
         </w:tc>
@@ -973,7 +1137,15 @@
         <w:t xml:space="preserve"> CAMBIOS DE MEDIDORES</w:t>
       </w:r>
       <w:r>
-        <w:t xml:space="preserve"> deben realizarse como máximo en 48 horas desde la publicación en WhatsApp grupal y informe de Contraste, reportar la ejecución inmediatamente bajo responsabilidad.</w:t>
+        <w:t xml:space="preserve"> deben realizarse como máximo en 48 horas desde la publicación en WhatsApp grupal </w:t>
+      </w:r>
+      <w:proofErr w:type="spellStart"/>
+      <w:r>
+        <w:t>y</w:t>
+      </w:r>
+      <w:proofErr w:type="spellEnd"/>
+      <w:r>
+        <w:t xml:space="preserve"> informe de Contraste, reportar la ejecución inmediatamente bajo responsabilidad.</w:t>
       </w:r>
     </w:p>
     <w:p>
@@ -1008,7 +1180,15 @@
         <w:ind w:right="0" w:firstLine="0"/>
       </w:pPr>
       <w:r>
-        <w:t>c) Reporte digital en archivo Excel de la OT, Cambios de medidores, fotografías fechadas y georeferenciadas enviadas por correo electrónico en formatos establecidos, puntualizando las observaciones encontradas y recomendando la normalización o mejoramiento de la instalación del suministro.</w:t>
+        <w:t xml:space="preserve">c) Reporte digital en archivo Excel de la OT, Cambios de medidores, fotografías fechadas y </w:t>
+      </w:r>
+      <w:proofErr w:type="spellStart"/>
+      <w:r>
+        <w:t>georeferenciadas</w:t>
+      </w:r>
+      <w:proofErr w:type="spellEnd"/>
+      <w:r>
+        <w:t xml:space="preserve"> enviadas por correo electrónico en formatos establecidos, puntualizando las observaciones encontradas y recomendando la normalización o mejoramiento de la instalación del suministro.</w:t>
       </w:r>
     </w:p>
     <w:p>
@@ -1023,7 +1203,23 @@
         <w:t>NOTA:</w:t>
       </w:r>
       <w:r>
-        <w:t xml:space="preserve"> {cr} informar diariamente con evidencias fotográficas en conformidad a los TDRs del contrato suscrito con EPU e informe técnico cada quincena La supervisión es muestral para llegar al indicador mensual, por lo que debe realizar en cada unidad zonal y/o servicio eléctrico</w:t>
+        <w:t xml:space="preserve"> {</w:t>
+      </w:r>
+      <w:proofErr w:type="spellStart"/>
+      <w:r>
+        <w:t>cr</w:t>
+      </w:r>
+      <w:proofErr w:type="spellEnd"/>
+      <w:r>
+        <w:t xml:space="preserve">} informar diariamente con evidencias fotográficas en conformidad a los </w:t>
+      </w:r>
+      <w:proofErr w:type="spellStart"/>
+      <w:r>
+        <w:t>TDRs</w:t>
+      </w:r>
+      <w:proofErr w:type="spellEnd"/>
+      <w:r>
+        <w:t xml:space="preserve"> del contrato suscrito con EPU e informe técnico cada quincena La supervisión es muestral para llegar al indicador mensual, por lo que debe realizar en cada unidad zonal y/o servicio eléctrico</w:t>
       </w:r>
     </w:p>
     <w:tbl>
@@ -1069,7 +1265,23 @@
                 <w:b/>
                 <w:sz w:val="18"/>
               </w:rPr>
-              <w:t>SUPERVISOR GENERAL "{cr}"</w:t>
+              <w:t>SUPERVISOR GENERAL "{</w:t>
+            </w:r>
+            <w:proofErr w:type="spellStart"/>
+            <w:r>
+              <w:rPr>
+                <w:b/>
+                <w:sz w:val="18"/>
+              </w:rPr>
+              <w:t>cr</w:t>
+            </w:r>
+            <w:proofErr w:type="spellEnd"/>
+            <w:r>
+              <w:rPr>
+                <w:b/>
+                <w:sz w:val="18"/>
+              </w:rPr>
+              <w:t>}"</w:t>
             </w:r>
           </w:p>
         </w:tc>
@@ -1121,7 +1333,23 @@
                 <w:b/>
                 <w:sz w:val="18"/>
               </w:rPr>
-              <w:t>COORDINADOR Y/O SUPERVISOR "{co}"</w:t>
+              <w:t>COORDINADOR Y/O SUPERVISOR "{</w:t>
+            </w:r>
+            <w:proofErr w:type="spellStart"/>
+            <w:r>
+              <w:rPr>
+                <w:b/>
+                <w:sz w:val="18"/>
+              </w:rPr>
+              <w:t>co</w:t>
+            </w:r>
+            <w:proofErr w:type="spellEnd"/>
+            <w:r>
+              <w:rPr>
+                <w:b/>
+                <w:sz w:val="18"/>
+              </w:rPr>
+              <w:t>}"</w:t>
             </w:r>
           </w:p>
         </w:tc>

</xml_diff>

<commit_message>
feat: reportes PDF, fix overlay genpdf, fix Word color azul, quitar generar por bloque
</commit_message>
<xml_diff>
--- a/public/templates/template_avisos.docx
+++ b/public/templates/template_avisos.docx
@@ -305,6 +305,14 @@
         <w:tblOverlap w:val="never"/>
         <w:tblW w:w="5274" w:type="dxa"/>
         <w:tblInd w:w="0" w:type="dxa"/>
+        <w:tblBorders>
+          <w:top w:val="single" w:sz="8" w:space="0" w:color="auto"/>
+          <w:left w:val="single" w:sz="8" w:space="0" w:color="auto"/>
+          <w:bottom w:val="single" w:sz="8" w:space="0" w:color="auto"/>
+          <w:right w:val="single" w:sz="8" w:space="0" w:color="auto"/>
+          <w:insideH w:val="single" w:sz="8" w:space="0" w:color="auto"/>
+          <w:insideV w:val="single" w:sz="8" w:space="0" w:color="auto"/>
+        </w:tblBorders>
         <w:tblCellMar>
           <w:top w:w="129" w:type="dxa"/>
           <w:left w:w="115" w:type="dxa"/>
@@ -323,12 +331,6 @@
         <w:tc>
           <w:tcPr>
             <w:tcW w:w="1923" w:type="dxa"/>
-            <w:tcBorders>
-              <w:top w:val="single" w:sz="12" w:space="0" w:color="000000"/>
-              <w:left w:val="single" w:sz="12" w:space="0" w:color="000000"/>
-              <w:bottom w:val="single" w:sz="12" w:space="0" w:color="000000"/>
-              <w:right w:val="single" w:sz="12" w:space="0" w:color="000000"/>
-            </w:tcBorders>
             <w:vAlign w:val="center"/>
           </w:tcPr>
           <w:p>
@@ -349,12 +351,6 @@
         <w:tc>
           <w:tcPr>
             <w:tcW w:w="3351" w:type="dxa"/>
-            <w:tcBorders>
-              <w:top w:val="single" w:sz="12" w:space="0" w:color="000000"/>
-              <w:left w:val="single" w:sz="12" w:space="0" w:color="000000"/>
-              <w:bottom w:val="single" w:sz="12" w:space="0" w:color="000000"/>
-              <w:right w:val="single" w:sz="12" w:space="0" w:color="000000"/>
-            </w:tcBorders>
           </w:tcPr>
           <w:p>
             <w:pPr>
@@ -387,8 +383,17 @@
           <w:b/>
           <w:sz w:val="18"/>
         </w:rPr>
-        <w:t>CUMPLIMIENTO    :</w:t>
-      </w:r>
+        <w:t xml:space="preserve">CUMPLIMIENTO  </w:t>
+      </w:r>
+      <w:proofErr w:type="gramStart"/>
+      <w:r>
+        <w:rPr>
+          <w:b/>
+          <w:sz w:val="18"/>
+        </w:rPr>
+        <w:t xml:space="preserve">  :</w:t>
+      </w:r>
+      <w:proofErr w:type="gramEnd"/>
       <w:r>
         <w:rPr>
           <w:b/>
@@ -418,8 +423,17 @@
           <w:b/>
           <w:sz w:val="18"/>
         </w:rPr>
-        <w:t>ACTIVIDAD             :</w:t>
-      </w:r>
+        <w:t xml:space="preserve">ACTIVIDAD           </w:t>
+      </w:r>
+      <w:proofErr w:type="gramStart"/>
+      <w:r>
+        <w:rPr>
+          <w:b/>
+          <w:sz w:val="18"/>
+        </w:rPr>
+        <w:t xml:space="preserve">  :</w:t>
+      </w:r>
+      <w:proofErr w:type="gramEnd"/>
       <w:r>
         <w:rPr>
           <w:b/>
@@ -467,8 +481,17 @@
           <w:b/>
           <w:sz w:val="18"/>
         </w:rPr>
-        <w:t>EDITADO POR        :</w:t>
-      </w:r>
+        <w:t xml:space="preserve">EDITADO POR      </w:t>
+      </w:r>
+      <w:proofErr w:type="gramStart"/>
+      <w:r>
+        <w:rPr>
+          <w:b/>
+          <w:sz w:val="18"/>
+        </w:rPr>
+        <w:t xml:space="preserve">  :</w:t>
+      </w:r>
+      <w:proofErr w:type="gramEnd"/>
       <w:r>
         <w:rPr>
           <w:b/>

</xml_diff>

<commit_message>
nombre de archivos al momento de descargar renombrado
</commit_message>
<xml_diff>
--- a/public/templates/template_avisos.docx
+++ b/public/templates/template_avisos.docx
@@ -1117,20 +1117,80 @@
     </w:p>
     <w:p>
       <w:pPr>
-        <w:ind w:left="-5"/>
-      </w:pPr>
-      <w:r>
-        <w:t>(1) Fecha límite entrega Incluye cargo, avisos de la verificación de medición y CD con todos los trabajos ejecutados con datos completos sin omisiones ni errores ingresados a mesa de partes.  Notificar como mínimo 2 días hábiles a la fecha programada con evidencias fotográficas y deben estar firmados el 100%</w:t>
+        <w:pStyle w:val="Prrafodelista"/>
+        <w:numPr>
+          <w:ilvl w:val="0"/>
+          <w:numId w:val="4"/>
+        </w:numPr>
+      </w:pPr>
+      <w:r>
+        <w:t xml:space="preserve">Fecha </w:t>
+      </w:r>
+      <w:r>
+        <w:t>límite</w:t>
+      </w:r>
+      <w:r>
+        <w:t xml:space="preserve"> entrega Incluye cargo, OT Firmado, avisos de</w:t>
+      </w:r>
+      <w:r>
+        <w:t xml:space="preserve"> la </w:t>
+      </w:r>
+      <w:r>
+        <w:t xml:space="preserve">verificación de medición </w:t>
+      </w:r>
+      <w:r>
+        <w:t>e</w:t>
+      </w:r>
+      <w:r>
+        <w:t xml:space="preserve"> </w:t>
+      </w:r>
+      <w:r>
+        <w:t>información</w:t>
+      </w:r>
+      <w:r>
+        <w:t xml:space="preserve"> de todos los trabajos ejecutados con datos completos sin omisiones ni errores ingresados a mesa de partes</w:t>
+      </w:r>
+      <w:r>
+        <w:t>.</w:t>
+      </w:r>
+      <w:r>
+        <w:t xml:space="preserve"> </w:t>
       </w:r>
     </w:p>
     <w:p>
       <w:pPr>
-        <w:spacing w:after="227"/>
-        <w:ind w:left="-5" w:right="0"/>
-      </w:pPr>
-      <w:r>
-        <w:t>(3) Se entrega la cantidad digital indicado de avisos y entregar en orden (Rotulado como indica semana)</w:t>
-      </w:r>
+        <w:pStyle w:val="Prrafodelista"/>
+        <w:numPr>
+          <w:ilvl w:val="0"/>
+          <w:numId w:val="4"/>
+        </w:numPr>
+      </w:pPr>
+      <w:r>
+        <w:t xml:space="preserve">Notificar 2 días hábiles antes como mínimo a la fecha programada del contraste con evidencias fotográficas y deben estar firmados el 100% de los avisos. </w:t>
+      </w:r>
+      <w:r>
+        <w:t xml:space="preserve"> </w:t>
+      </w:r>
+    </w:p>
+    <w:p>
+      <w:pPr>
+        <w:pStyle w:val="Prrafodelista"/>
+        <w:numPr>
+          <w:ilvl w:val="0"/>
+          <w:numId w:val="4"/>
+        </w:numPr>
+      </w:pPr>
+      <w:r>
+        <w:t>Se entrega la cantidad digital indicado de avisos y entregar en orden (Rotulado como indica semana y OT)</w:t>
+      </w:r>
+      <w:r>
+        <w:t>.</w:t>
+      </w:r>
+    </w:p>
+    <w:p>
+      <w:pPr>
+        <w:ind w:left="-15" w:firstLine="0"/>
+      </w:pPr>
     </w:p>
     <w:p>
       <w:pPr>
@@ -1151,24 +1211,38 @@
         <w:ind w:left="0" w:right="0" w:firstLine="0"/>
       </w:pPr>
       <w:r>
-        <w:t>a) Los</w:t>
+        <w:t>a) L</w:t>
+      </w:r>
+      <w:r>
+        <w:t xml:space="preserve">os </w:t>
       </w:r>
       <w:r>
         <w:rPr>
           <w:b/>
+          <w:bCs/>
         </w:rPr>
-        <w:t xml:space="preserve"> CAMBIOS DE MEDIDORES</w:t>
+        <w:t>CAMBIOS DE MEDIDORES</w:t>
       </w:r>
       <w:r>
         <w:t xml:space="preserve"> deben realizarse como máximo en 48 horas desde la publicación en WhatsApp grupal </w:t>
       </w:r>
-      <w:proofErr w:type="spellStart"/>
-      <w:r>
-        <w:t>y</w:t>
-      </w:r>
-      <w:proofErr w:type="spellEnd"/>
-      <w:r>
-        <w:t xml:space="preserve"> informe de Contraste, reportar la ejecución inmediatamente bajo responsabilidad.</w:t>
+      <w:r>
+        <w:t>e</w:t>
+      </w:r>
+      <w:r>
+        <w:t xml:space="preserve"> informe de </w:t>
+      </w:r>
+      <w:r>
+        <w:t>Contraste,</w:t>
+      </w:r>
+      <w:r>
+        <w:t xml:space="preserve"> reportar la </w:t>
+      </w:r>
+      <w:r>
+        <w:t>ejecución</w:t>
+      </w:r>
+      <w:r>
+        <w:t xml:space="preserve"> inmediatamente bajo responsabilidad.</w:t>
       </w:r>
     </w:p>
     <w:p>
@@ -1176,25 +1250,51 @@
         <w:ind w:left="0" w:right="0" w:firstLine="0"/>
       </w:pPr>
       <w:r>
-        <w:t xml:space="preserve">b) Los </w:t>
+        <w:t>b) L</w:t>
+      </w:r>
+      <w:r>
+        <w:t xml:space="preserve">os </w:t>
       </w:r>
       <w:r>
         <w:rPr>
           <w:b/>
+          <w:bCs/>
         </w:rPr>
         <w:t>CAMBIOS DE MEDIDORES</w:t>
       </w:r>
       <w:r>
-        <w:t xml:space="preserve"> se deben de informar en el SIELSE considerando las fechas de lectura y facturación, </w:t>
+        <w:t xml:space="preserve"> se deben de informar en el SIELSE considerando las fechas de lectura y </w:t>
+      </w:r>
+      <w:r>
+        <w:t>facturación</w:t>
+      </w:r>
+      <w:r>
+        <w:t xml:space="preserve">, </w:t>
       </w:r>
       <w:r>
         <w:rPr>
           <w:b/>
+          <w:bCs/>
         </w:rPr>
-        <w:t xml:space="preserve">subir expediente al SIELSE </w:t>
-      </w:r>
-      <w:r>
-        <w:t xml:space="preserve">el archivo de Actas escaneados, Fotografías del antes y después de la ejecución. </w:t>
+        <w:t>subir expediente al SIELSE</w:t>
+      </w:r>
+      <w:r>
+        <w:t xml:space="preserve"> el archivo de Actas escaneados, </w:t>
+      </w:r>
+      <w:r>
+        <w:t>f</w:t>
+      </w:r>
+      <w:r>
+        <w:t>otografías</w:t>
+      </w:r>
+      <w:r>
+        <w:t xml:space="preserve"> del antes y </w:t>
+      </w:r>
+      <w:r>
+        <w:t>después</w:t>
+      </w:r>
+      <w:r>
+        <w:t xml:space="preserve"> de la ejecución.</w:t>
       </w:r>
     </w:p>
     <w:p>
@@ -1203,15 +1303,77 @@
         <w:ind w:right="0" w:firstLine="0"/>
       </w:pPr>
       <w:r>
-        <w:t xml:space="preserve">c) Reporte digital en archivo Excel de la OT, Cambios de medidores, fotografías fechadas y </w:t>
-      </w:r>
-      <w:proofErr w:type="spellStart"/>
-      <w:r>
-        <w:t>georeferenciadas</w:t>
-      </w:r>
-      <w:proofErr w:type="spellEnd"/>
-      <w:r>
-        <w:t xml:space="preserve"> enviadas por correo electrónico en formatos establecidos, puntualizando las observaciones encontradas y recomendando la normalización o mejoramiento de la instalación del suministro.</w:t>
+        <w:t xml:space="preserve">c) </w:t>
+      </w:r>
+      <w:r>
+        <w:t>El</w:t>
+      </w:r>
+      <w:r>
+        <w:t xml:space="preserve"> </w:t>
+      </w:r>
+      <w:r>
+        <w:rPr>
+          <w:b/>
+          <w:bCs/>
+        </w:rPr>
+        <w:t>REPORTE DE ACTAS CAMBIOS DE MEDIDORES</w:t>
+      </w:r>
+      <w:r>
+        <w:t xml:space="preserve"> </w:t>
+      </w:r>
+      <w:r>
+        <w:t>deberá</w:t>
+      </w:r>
+      <w:r>
+        <w:t xml:space="preserve"> ser al </w:t>
+      </w:r>
+      <w:r>
+        <w:t>día</w:t>
+      </w:r>
+      <w:r>
+        <w:t xml:space="preserve"> siguiente de la ejecución </w:t>
+      </w:r>
+      <w:r>
+        <w:t>física</w:t>
+      </w:r>
+      <w:r>
+        <w:t xml:space="preserve"> y digital en archivo Excel de la O</w:t>
+      </w:r>
+      <w:r>
+        <w:t xml:space="preserve">T, </w:t>
+      </w:r>
+      <w:r>
+        <w:t>fotograf</w:t>
+      </w:r>
+      <w:r>
+        <w:t>í</w:t>
+      </w:r>
+      <w:r>
+        <w:t xml:space="preserve">as fechadas y </w:t>
+      </w:r>
+      <w:r>
+        <w:t>georreferenciadas</w:t>
+      </w:r>
+      <w:r>
+        <w:t xml:space="preserve"> enviadas por correo</w:t>
+      </w:r>
+      <w:r>
+        <w:t xml:space="preserve"> </w:t>
+      </w:r>
+      <w:r>
+        <w:t>electr</w:t>
+      </w:r>
+      <w:r>
+        <w:t>ó</w:t>
+      </w:r>
+      <w:r>
+        <w:t xml:space="preserve">nico en formatos establecidos, puntualizando las </w:t>
+      </w:r>
+      <w:r>
+        <w:t>observaciones</w:t>
+      </w:r>
+      <w:r>
+        <w:t xml:space="preserve"> encontradas y recomendando la normalización o mejoramiento de la instalación del suministro.</w:t>
       </w:r>
     </w:p>
     <w:p>
@@ -1226,7 +1388,10 @@
         <w:t>NOTA:</w:t>
       </w:r>
       <w:r>
-        <w:t xml:space="preserve"> {cr} informar diariamente con evidencias fotográficas en conformidad a los </w:t>
+        <w:t xml:space="preserve"> {cr} </w:t>
+      </w:r>
+      <w:r>
+        <w:t xml:space="preserve">Consorcio SUPERVISOR informar diariamente con evidencias fotográficas en conformidad a los </w:t>
       </w:r>
       <w:proofErr w:type="spellStart"/>
       <w:r>
@@ -1507,6 +1672,95 @@
 <file path=word/numbering.xml><?xml version="1.0" encoding="utf-8"?>
 <w:numbering xmlns:wpc="http://schemas.microsoft.com/office/word/2010/wordprocessingCanvas" xmlns:cx="http://schemas.microsoft.com/office/drawing/2014/chartex" xmlns:cx1="http://schemas.microsoft.com/office/drawing/2015/9/8/chartex" xmlns:cx2="http://schemas.microsoft.com/office/drawing/2015/10/21/chartex" xmlns:cx3="http://schemas.microsoft.com/office/drawing/2016/5/9/chartex" xmlns:cx4="http://schemas.microsoft.com/office/drawing/2016/5/10/chartex" xmlns:cx5="http://schemas.microsoft.com/office/drawing/2016/5/11/chartex" xmlns:cx6="http://schemas.microsoft.com/office/drawing/2016/5/12/chartex" xmlns:cx7="http://schemas.microsoft.com/office/drawing/2016/5/13/chartex" xmlns:cx8="http://schemas.microsoft.com/office/drawing/2016/5/14/chartex" xmlns:mc="http://schemas.openxmlformats.org/markup-compatibility/2006" xmlns:aink="http://schemas.microsoft.com/office/drawing/2016/ink" xmlns:am3d="http://schemas.microsoft.com/office/drawing/2017/model3d" xmlns:o="urn:schemas-microsoft-com:office:office" xmlns:r="http://schemas.openxmlformats.org/officeDocument/2006/relationships" xmlns:m="http://schemas.openxmlformats.org/officeDocument/2006/math" xmlns:v="urn:schemas-microsoft-com:vml" xmlns:wp14="http://schemas.microsoft.com/office/word/2010/wordprocessingDrawing" xmlns:wp="http://schemas.openxmlformats.org/drawingml/2006/wordprocessingDrawing" xmlns:w10="urn:schemas-microsoft-com:office:word" xmlns:w="http://schemas.openxmlformats.org/wordprocessingml/2006/main" xmlns:w14="http://schemas.microsoft.com/office/word/2010/wordml" xmlns:w15="http://schemas.microsoft.com/office/word/2012/wordml" xmlns:w16cex="http://schemas.microsoft.com/office/word/2018/wordml/cex" xmlns:w16cid="http://schemas.microsoft.com/office/word/2016/wordml/cid" xmlns:w16="http://schemas.microsoft.com/office/word/2018/wordml" xmlns:w16sdtdh="http://schemas.microsoft.com/office/word/2020/wordml/sdtdatahash" xmlns:w16se="http://schemas.microsoft.com/office/word/2015/wordml/symex" xmlns:wpg="http://schemas.microsoft.com/office/word/2010/wordprocessingGroup" xmlns:wpi="http://schemas.microsoft.com/office/word/2010/wordprocessingInk" xmlns:wne="http://schemas.microsoft.com/office/word/2006/wordml" xmlns:wps="http://schemas.microsoft.com/office/word/2010/wordprocessingShape" mc:Ignorable="w14 w15 w16se w16cid w16 w16cex w16sdtdh wp14">
   <w:abstractNum w:abstractNumId="0" w15:restartNumberingAfterBreak="0">
+    <w:nsid w:val="03713DD2"/>
+    <w:multiLevelType w:val="hybridMultilevel"/>
+    <w:tmpl w:val="205CC24A"/>
+    <w:lvl w:ilvl="0" w:tplc="53D8FA8A">
+      <w:start w:val="1"/>
+      <w:numFmt w:val="decimal"/>
+      <w:lvlText w:val="(%1)"/>
+      <w:lvlJc w:val="left"/>
+      <w:pPr>
+        <w:ind w:left="345" w:hanging="360"/>
+      </w:pPr>
+      <w:rPr>
+        <w:rFonts w:hint="default"/>
+      </w:rPr>
+    </w:lvl>
+    <w:lvl w:ilvl="1" w:tplc="280A0019" w:tentative="1">
+      <w:start w:val="1"/>
+      <w:numFmt w:val="lowerLetter"/>
+      <w:lvlText w:val="%2."/>
+      <w:lvlJc w:val="left"/>
+      <w:pPr>
+        <w:ind w:left="1065" w:hanging="360"/>
+      </w:pPr>
+    </w:lvl>
+    <w:lvl w:ilvl="2" w:tplc="280A001B" w:tentative="1">
+      <w:start w:val="1"/>
+      <w:numFmt w:val="lowerRoman"/>
+      <w:lvlText w:val="%3."/>
+      <w:lvlJc w:val="right"/>
+      <w:pPr>
+        <w:ind w:left="1785" w:hanging="180"/>
+      </w:pPr>
+    </w:lvl>
+    <w:lvl w:ilvl="3" w:tplc="280A000F" w:tentative="1">
+      <w:start w:val="1"/>
+      <w:numFmt w:val="decimal"/>
+      <w:lvlText w:val="%4."/>
+      <w:lvlJc w:val="left"/>
+      <w:pPr>
+        <w:ind w:left="2505" w:hanging="360"/>
+      </w:pPr>
+    </w:lvl>
+    <w:lvl w:ilvl="4" w:tplc="280A0019" w:tentative="1">
+      <w:start w:val="1"/>
+      <w:numFmt w:val="lowerLetter"/>
+      <w:lvlText w:val="%5."/>
+      <w:lvlJc w:val="left"/>
+      <w:pPr>
+        <w:ind w:left="3225" w:hanging="360"/>
+      </w:pPr>
+    </w:lvl>
+    <w:lvl w:ilvl="5" w:tplc="280A001B" w:tentative="1">
+      <w:start w:val="1"/>
+      <w:numFmt w:val="lowerRoman"/>
+      <w:lvlText w:val="%6."/>
+      <w:lvlJc w:val="right"/>
+      <w:pPr>
+        <w:ind w:left="3945" w:hanging="180"/>
+      </w:pPr>
+    </w:lvl>
+    <w:lvl w:ilvl="6" w:tplc="280A000F" w:tentative="1">
+      <w:start w:val="1"/>
+      <w:numFmt w:val="decimal"/>
+      <w:lvlText w:val="%7."/>
+      <w:lvlJc w:val="left"/>
+      <w:pPr>
+        <w:ind w:left="4665" w:hanging="360"/>
+      </w:pPr>
+    </w:lvl>
+    <w:lvl w:ilvl="7" w:tplc="280A0019" w:tentative="1">
+      <w:start w:val="1"/>
+      <w:numFmt w:val="lowerLetter"/>
+      <w:lvlText w:val="%8."/>
+      <w:lvlJc w:val="left"/>
+      <w:pPr>
+        <w:ind w:left="5385" w:hanging="360"/>
+      </w:pPr>
+    </w:lvl>
+    <w:lvl w:ilvl="8" w:tplc="280A001B" w:tentative="1">
+      <w:start w:val="1"/>
+      <w:numFmt w:val="lowerRoman"/>
+      <w:lvlText w:val="%9."/>
+      <w:lvlJc w:val="right"/>
+      <w:pPr>
+        <w:ind w:left="6105" w:hanging="180"/>
+      </w:pPr>
+    </w:lvl>
+  </w:abstractNum>
+  <w:abstractNum w:abstractNumId="1" w15:restartNumberingAfterBreak="0">
     <w:nsid w:val="042B25AE"/>
     <w:multiLevelType w:val="hybridMultilevel"/>
     <w:tmpl w:val="649C4A16"/>
@@ -1718,7 +1972,7 @@
       </w:rPr>
     </w:lvl>
   </w:abstractNum>
-  <w:abstractNum w:abstractNumId="1" w15:restartNumberingAfterBreak="0">
+  <w:abstractNum w:abstractNumId="2" w15:restartNumberingAfterBreak="0">
     <w:nsid w:val="19591CC4"/>
     <w:multiLevelType w:val="hybridMultilevel"/>
     <w:tmpl w:val="6B96BC0E"/>
@@ -1930,7 +2184,7 @@
       </w:rPr>
     </w:lvl>
   </w:abstractNum>
-  <w:abstractNum w:abstractNumId="2" w15:restartNumberingAfterBreak="0">
+  <w:abstractNum w:abstractNumId="3" w15:restartNumberingAfterBreak="0">
     <w:nsid w:val="6702146C"/>
     <w:multiLevelType w:val="hybridMultilevel"/>
     <w:tmpl w:val="2BC8FB98"/>
@@ -2020,13 +2274,16 @@
     </w:lvl>
   </w:abstractNum>
   <w:num w:numId="1">
-    <w:abstractNumId w:val="0"/>
+    <w:abstractNumId w:val="1"/>
   </w:num>
   <w:num w:numId="2">
-    <w:abstractNumId w:val="1"/>
+    <w:abstractNumId w:val="2"/>
   </w:num>
   <w:num w:numId="3">
-    <w:abstractNumId w:val="2"/>
+    <w:abstractNumId w:val="3"/>
+  </w:num>
+  <w:num w:numId="4">
+    <w:abstractNumId w:val="0"/>
   </w:num>
 </w:numbering>
 </file>
@@ -2442,7 +2699,6 @@
   <w:style w:type="character" w:default="1" w:styleId="Fuentedeprrafopredeter">
     <w:name w:val="Default Paragraph Font"/>
     <w:uiPriority w:val="1"/>
-    <w:semiHidden/>
     <w:unhideWhenUsed/>
   </w:style>
   <w:style w:type="table" w:default="1" w:styleId="Tablanormal">

</xml_diff>

<commit_message>
exportación e importación de excel, ordenar por ot
</commit_message>
<xml_diff>
--- a/public/templates/template_avisos.docx
+++ b/public/templates/template_avisos.docx
@@ -834,7 +834,7 @@
       </w:tr>
       <w:tr>
         <w:trPr>
-          <w:trHeight w:hRule="exact" w:val="431"/>
+          <w:trHeight w:hRule="exact" w:val="534"/>
         </w:trPr>
         <w:tc>
           <w:tcPr>
@@ -1017,27 +1017,15 @@
               <w:jc w:val="center"/>
             </w:pPr>
             <w:r>
-              <w:rPr>
-                <w:rFonts w:ascii="Arial" w:eastAsia="Arial" w:hAnsi="Arial" w:cs="Arial"/>
-                <w:sz w:val="15"/>
-              </w:rPr>
-              <w:t>{</w:t>
+              <w:t xml:space="preserve">2 </w:t>
             </w:r>
             <w:proofErr w:type="spellStart"/>
             <w:r>
-              <w:rPr>
-                <w:rFonts w:ascii="Arial" w:eastAsia="Arial" w:hAnsi="Arial" w:cs="Arial"/>
-                <w:sz w:val="15"/>
-              </w:rPr>
-              <w:t>pz</w:t>
+              <w:t>d.h</w:t>
             </w:r>
             <w:proofErr w:type="spellEnd"/>
             <w:r>
-              <w:rPr>
-                <w:rFonts w:ascii="Arial" w:eastAsia="Arial" w:hAnsi="Arial" w:cs="Arial"/>
-                <w:sz w:val="15"/>
-              </w:rPr>
-              <w:t>}</w:t>
+              <w:t>. antes de contraste</w:t>
             </w:r>
           </w:p>
         </w:tc>
@@ -1124,13 +1112,7 @@
         </w:numPr>
       </w:pPr>
       <w:r>
-        <w:t xml:space="preserve">Fecha </w:t>
-      </w:r>
-      <w:r>
-        <w:t>límite</w:t>
-      </w:r>
-      <w:r>
-        <w:t xml:space="preserve"> entrega Incluye cargo, OT Firmado, avisos de</w:t>
+        <w:t>Fecha límite entrega Incluye cargo, OT Firmado, avisos de</w:t>
       </w:r>
       <w:r>
         <w:t xml:space="preserve"> la </w:t>
@@ -1142,13 +1124,7 @@
         <w:t>e</w:t>
       </w:r>
       <w:r>
-        <w:t xml:space="preserve"> </w:t>
-      </w:r>
-      <w:r>
-        <w:t>información</w:t>
-      </w:r>
-      <w:r>
-        <w:t xml:space="preserve"> de todos los trabajos ejecutados con datos completos sin omisiones ni errores ingresados a mesa de partes</w:t>
+        <w:t xml:space="preserve"> información de todos los trabajos ejecutados con datos completos sin omisiones ni errores ingresados a mesa de partes</w:t>
       </w:r>
       <w:r>
         <w:t>.</w:t>
@@ -1230,19 +1206,7 @@
         <w:t>e</w:t>
       </w:r>
       <w:r>
-        <w:t xml:space="preserve"> informe de </w:t>
-      </w:r>
-      <w:r>
-        <w:t>Contraste,</w:t>
-      </w:r>
-      <w:r>
-        <w:t xml:space="preserve"> reportar la </w:t>
-      </w:r>
-      <w:r>
-        <w:t>ejecución</w:t>
-      </w:r>
-      <w:r>
-        <w:t xml:space="preserve"> inmediatamente bajo responsabilidad.</w:t>
+        <w:t xml:space="preserve"> informe de Contraste, reportar la ejecución inmediatamente bajo responsabilidad.</w:t>
       </w:r>
     </w:p>
     <w:p>
@@ -1263,13 +1227,7 @@
         <w:t>CAMBIOS DE MEDIDORES</w:t>
       </w:r>
       <w:r>
-        <w:t xml:space="preserve"> se deben de informar en el SIELSE considerando las fechas de lectura y </w:t>
-      </w:r>
-      <w:r>
-        <w:t>facturación</w:t>
-      </w:r>
-      <w:r>
-        <w:t xml:space="preserve">, </w:t>
+        <w:t xml:space="preserve"> se deben de informar en el SIELSE considerando las fechas de lectura y facturación, </w:t>
       </w:r>
       <w:r>
         <w:rPr>
@@ -1285,16 +1243,7 @@
         <w:t>f</w:t>
       </w:r>
       <w:r>
-        <w:t>otografías</w:t>
-      </w:r>
-      <w:r>
-        <w:t xml:space="preserve"> del antes y </w:t>
-      </w:r>
-      <w:r>
-        <w:t>después</w:t>
-      </w:r>
-      <w:r>
-        <w:t xml:space="preserve"> de la ejecución.</w:t>
+        <w:t>otografías del antes y después de la ejecución.</w:t>
       </w:r>
     </w:p>
     <w:p>
@@ -1319,61 +1268,31 @@
         <w:t>REPORTE DE ACTAS CAMBIOS DE MEDIDORES</w:t>
       </w:r>
       <w:r>
+        <w:t xml:space="preserve"> deberá ser al día siguiente de la ejecución física y digital en archivo Excel de la O</w:t>
+      </w:r>
+      <w:r>
+        <w:t xml:space="preserve">T, </w:t>
+      </w:r>
+      <w:r>
+        <w:t xml:space="preserve">fotografías fechadas y </w:t>
+      </w:r>
+      <w:r>
+        <w:t>georreferenciadas</w:t>
+      </w:r>
+      <w:r>
+        <w:t xml:space="preserve"> enviadas por correo</w:t>
+      </w:r>
+      <w:r>
         <w:t xml:space="preserve"> </w:t>
       </w:r>
       <w:r>
-        <w:t>deberá</w:t>
-      </w:r>
-      <w:r>
-        <w:t xml:space="preserve"> ser al </w:t>
-      </w:r>
-      <w:r>
-        <w:t>día</w:t>
-      </w:r>
-      <w:r>
-        <w:t xml:space="preserve"> siguiente de la ejecución </w:t>
-      </w:r>
-      <w:r>
-        <w:t>física</w:t>
-      </w:r>
-      <w:r>
-        <w:t xml:space="preserve"> y digital en archivo Excel de la O</w:t>
-      </w:r>
-      <w:r>
-        <w:t xml:space="preserve">T, </w:t>
-      </w:r>
-      <w:r>
-        <w:t>fotograf</w:t>
-      </w:r>
-      <w:r>
-        <w:t>í</w:t>
-      </w:r>
-      <w:r>
-        <w:t xml:space="preserve">as fechadas y </w:t>
-      </w:r>
-      <w:r>
-        <w:t>georreferenciadas</w:t>
-      </w:r>
-      <w:r>
-        <w:t xml:space="preserve"> enviadas por correo</w:t>
-      </w:r>
-      <w:r>
-        <w:t xml:space="preserve"> </w:t>
-      </w:r>
-      <w:r>
         <w:t>electr</w:t>
       </w:r>
       <w:r>
         <w:t>ó</w:t>
       </w:r>
       <w:r>
-        <w:t xml:space="preserve">nico en formatos establecidos, puntualizando las </w:t>
-      </w:r>
-      <w:r>
-        <w:t>observaciones</w:t>
-      </w:r>
-      <w:r>
-        <w:t xml:space="preserve"> encontradas y recomendando la normalización o mejoramiento de la instalación del suministro.</w:t>
+        <w:t>nico en formatos establecidos, puntualizando las observaciones encontradas y recomendando la normalización o mejoramiento de la instalación del suministro.</w:t>
       </w:r>
     </w:p>
     <w:p>
@@ -2699,6 +2618,7 @@
   <w:style w:type="character" w:default="1" w:styleId="Fuentedeprrafopredeter">
     <w:name w:val="Default Paragraph Font"/>
     <w:uiPriority w:val="1"/>
+    <w:semiHidden/>
     <w:unhideWhenUsed/>
   </w:style>
   <w:style w:type="table" w:default="1" w:styleId="Tablanormal">

</xml_diff>